<commit_message>
add acceptance test results to MAT.docx
</commit_message>
<xml_diff>
--- a/12-AT/MAT.docx
+++ b/12-AT/MAT.docx
@@ -521,32 +521,6 @@
               <w:t>PASS</w:t>
             </w:r>
           </w:p>
-          <w:p>
-            <w:pPr>
-              <w:snapToGrid w:val="0"/>
-              <w:spacing w:line="240" w:lineRule="auto"/>
-              <w:jc w:val="center"/>
-              <w:rPr>
-                <w:rFonts w:cs="Arial"/>
-                <w:b/>
-                <w:color w:val="FF0000"/>
-                <w:sz w:val="20"/>
-                <w:szCs w:val="20"/>
-                <w:lang w:val="en-GB"/>
-              </w:rPr>
-            </w:pPr>
-            <w:r>
-              <w:rPr>
-                <w:rFonts w:cs="Arial"/>
-                <w:b/>
-                <w:color w:val="FF0000"/>
-                <w:sz w:val="20"/>
-                <w:szCs w:val="20"/>
-                <w:lang w:val="en-GB"/>
-              </w:rPr>
-              <w:t>FAIL</w:t>
-            </w:r>
-          </w:p>
         </w:tc>
       </w:tr>
       <w:tr>
@@ -643,7 +617,7 @@
                 <w:szCs w:val="20"/>
                 <w:lang w:val="en-GB"/>
               </w:rPr>
-              <w:t>…</w:t>
+              <w:t> </w:t>
             </w:r>
           </w:p>
           <w:p>
@@ -733,30 +707,6 @@
                 <w:lang w:val="en-GB"/>
               </w:rPr>
               <w:t>PASS</w:t>
-            </w:r>
-          </w:p>
-          <w:p>
-            <w:pPr>
-              <w:snapToGrid w:val="0"/>
-              <w:spacing w:line="240" w:lineRule="auto"/>
-              <w:jc w:val="center"/>
-              <w:rPr>
-                <w:rFonts w:cs="Arial"/>
-                <w:sz w:val="20"/>
-                <w:szCs w:val="20"/>
-                <w:lang w:val="en-GB"/>
-              </w:rPr>
-            </w:pPr>
-            <w:r>
-              <w:rPr>
-                <w:rFonts w:cs="Arial"/>
-                <w:b/>
-                <w:color w:val="FF0000"/>
-                <w:sz w:val="20"/>
-                <w:szCs w:val="20"/>
-                <w:lang w:val="en-GB"/>
-              </w:rPr>
-              <w:t>FAIL</w:t>
             </w:r>
           </w:p>
         </w:tc>
@@ -854,11 +804,13 @@
             <w:r>
               <w:rPr>
                 <w:rFonts w:cs="Arial"/>
-                <w:sz w:val="20"/>
-                <w:szCs w:val="20"/>
-                <w:lang w:val="en-GB"/>
-              </w:rPr>
-              <w:t>…</w:t>
+                <w:b/>
+                <w:color w:val="008000"/>
+                <w:sz w:val="20"/>
+                <w:szCs w:val="20"/>
+                <w:lang w:val="en-GB"/>
+              </w:rPr>
+              <w:t>PASS</w:t>
             </w:r>
           </w:p>
         </w:tc>
@@ -956,11 +908,13 @@
             <w:r>
               <w:rPr>
                 <w:rFonts w:cs="Arial"/>
-                <w:sz w:val="20"/>
-                <w:szCs w:val="20"/>
-                <w:lang w:val="en-GB"/>
-              </w:rPr>
-              <w:t>…</w:t>
+                <w:b/>
+                <w:color w:val="008000"/>
+                <w:sz w:val="20"/>
+                <w:szCs w:val="20"/>
+                <w:lang w:val="en-GB"/>
+              </w:rPr>
+              <w:t>PASS</w:t>
             </w:r>
           </w:p>
         </w:tc>
@@ -1098,7 +1052,7 @@
           <w:szCs w:val="20"/>
           <w:lang w:val="en-GB"/>
         </w:rPr>
-        <w:t>AT02: Failed registration attempt after providing…</w:t>
+        <w:t>AT02: Failed registration attempt due to missing required fields</w:t>
       </w:r>
     </w:p>
     <w:p>
@@ -1423,32 +1377,6 @@
               <w:t>PASS</w:t>
             </w:r>
           </w:p>
-          <w:p>
-            <w:pPr>
-              <w:snapToGrid w:val="0"/>
-              <w:spacing w:line="240" w:lineRule="auto"/>
-              <w:jc w:val="center"/>
-              <w:rPr>
-                <w:rFonts w:cs="Arial"/>
-                <w:b/>
-                <w:color w:val="FF0000"/>
-                <w:sz w:val="20"/>
-                <w:szCs w:val="20"/>
-                <w:lang w:val="en-GB"/>
-              </w:rPr>
-            </w:pPr>
-            <w:r>
-              <w:rPr>
-                <w:rFonts w:cs="Arial"/>
-                <w:b/>
-                <w:color w:val="FF0000"/>
-                <w:sz w:val="20"/>
-                <w:szCs w:val="20"/>
-                <w:lang w:val="en-GB"/>
-              </w:rPr>
-              <w:t>FAIL</w:t>
-            </w:r>
-          </w:p>
         </w:tc>
       </w:tr>
       <w:tr>
@@ -1504,7 +1432,7 @@
                 <w:szCs w:val="20"/>
                 <w:lang w:val="en-GB"/>
               </w:rPr>
-              <w:t>House number = 1</w:t>
+              <w:t> </w:t>
             </w:r>
           </w:p>
           <w:p>
@@ -1546,7 +1474,7 @@
                 <w:szCs w:val="20"/>
                 <w:lang w:val="en-GB"/>
               </w:rPr>
-              <w:t>…</w:t>
+              <w:t> </w:t>
             </w:r>
           </w:p>
           <w:p>
@@ -1636,30 +1564,6 @@
                 <w:lang w:val="en-GB"/>
               </w:rPr>
               <w:t>PASS</w:t>
-            </w:r>
-          </w:p>
-          <w:p>
-            <w:pPr>
-              <w:snapToGrid w:val="0"/>
-              <w:spacing w:line="240" w:lineRule="auto"/>
-              <w:jc w:val="center"/>
-              <w:rPr>
-                <w:rFonts w:cs="Arial"/>
-                <w:sz w:val="20"/>
-                <w:szCs w:val="20"/>
-                <w:lang w:val="en-GB"/>
-              </w:rPr>
-            </w:pPr>
-            <w:r>
-              <w:rPr>
-                <w:rFonts w:cs="Arial"/>
-                <w:b/>
-                <w:color w:val="FF0000"/>
-                <w:sz w:val="20"/>
-                <w:szCs w:val="20"/>
-                <w:lang w:val="en-GB"/>
-              </w:rPr>
-              <w:t>FAIL</w:t>
             </w:r>
           </w:p>
         </w:tc>
@@ -1757,11 +1661,13 @@
             <w:r>
               <w:rPr>
                 <w:rFonts w:cs="Arial"/>
-                <w:sz w:val="20"/>
-                <w:szCs w:val="20"/>
-                <w:lang w:val="en-GB"/>
-              </w:rPr>
-              <w:t>…</w:t>
+                <w:b/>
+                <w:color w:val="008000"/>
+                <w:sz w:val="20"/>
+                <w:szCs w:val="20"/>
+                <w:lang w:val="en-GB"/>
+              </w:rPr>
+              <w:t>PASS</w:t>
             </w:r>
           </w:p>
         </w:tc>
@@ -1859,11 +1765,13 @@
             <w:r>
               <w:rPr>
                 <w:rFonts w:cs="Arial"/>
-                <w:sz w:val="20"/>
-                <w:szCs w:val="20"/>
-                <w:lang w:val="en-GB"/>
-              </w:rPr>
-              <w:t>…</w:t>
+                <w:b/>
+                <w:color w:val="008000"/>
+                <w:sz w:val="20"/>
+                <w:szCs w:val="20"/>
+                <w:lang w:val="en-GB"/>
+              </w:rPr>
+              <w:t>PASS</w:t>
             </w:r>
           </w:p>
         </w:tc>

</xml_diff>